<commit_message>
Improve contact assistant and project roadmap
</commit_message>
<xml_diff>
--- a/assets/Mohammed_Siddique_Master_CV.docx
+++ b/assets/Mohammed_Siddique_Master_CV.docx
@@ -56,6 +56,48 @@
           <w:sz w:val="19"/>
         </w:rPr>
         <w:t>LinkedIn: www.linkedin.com/in/mohammedsiddique-ds</w:t>
+      </w:r>
+    </w:p>
+    <w:p>
+      <w:pPr>
+        <w:spacing w:before="0" w:after="20" w:line="240" w:lineRule="auto"/>
+        <w:jc w:val="center"/>
+      </w:pPr>
+      <w:r>
+        <w:rPr>
+          <w:rFonts w:ascii="Calibri" w:hAnsi="Calibri"/>
+          <w:b w:val="0"/>
+          <w:sz w:val="19"/>
+        </w:rPr>
+        <w:t>Portfolio: https://mohammed-siddique-data-ai-portfolio.vercel.app</w:t>
+      </w:r>
+    </w:p>
+    <w:p>
+      <w:pPr>
+        <w:spacing w:before="0" w:after="20" w:line="240" w:lineRule="auto"/>
+        <w:jc w:val="center"/>
+      </w:pPr>
+      <w:r>
+        <w:rPr>
+          <w:rFonts w:ascii="Calibri" w:hAnsi="Calibri"/>
+          <w:b w:val="0"/>
+          <w:sz w:val="19"/>
+        </w:rPr>
+        <w:t>GitHub: https://github.com/MohammedSiddique8998</w:t>
+      </w:r>
+    </w:p>
+    <w:p>
+      <w:pPr>
+        <w:spacing w:before="0" w:after="20" w:line="240" w:lineRule="auto"/>
+        <w:jc w:val="center"/>
+      </w:pPr>
+      <w:r>
+        <w:rPr>
+          <w:rFonts w:ascii="Calibri" w:hAnsi="Calibri"/>
+          <w:b w:val="0"/>
+          <w:sz w:val="19"/>
+        </w:rPr>
+        <w:t>Portfolio Repository: https://github.com/MohammedSiddique8998/mohammed-siddique-data-ai-portfolio</w:t>
       </w:r>
     </w:p>
     <w:p>
@@ -1657,6 +1699,102 @@
           <w:sz w:val="20"/>
         </w:rPr>
         <w:t>Practised preparing raw data for analysis, validating assumptions and presenting findings through clear reports and visuals.</w:t>
+      </w:r>
+    </w:p>
+    <w:p>
+      <w:pPr>
+        <w:spacing w:before="0" w:after="60" w:line="240" w:lineRule="auto"/>
+      </w:pPr>
+      <w:r>
+        <w:rPr>
+          <w:rFonts w:ascii="Calibri" w:hAnsi="Calibri"/>
+          <w:b w:val="0"/>
+          <w:sz w:val="21"/>
+        </w:rPr>
+        <w:t>Interactive Data Science and AI Portfolio Website</w:t>
+      </w:r>
+    </w:p>
+    <w:p>
+      <w:pPr>
+        <w:spacing w:before="0" w:after="60" w:line="240" w:lineRule="auto"/>
+      </w:pPr>
+      <w:r>
+        <w:rPr>
+          <w:rFonts w:ascii="Calibri" w:hAnsi="Calibri"/>
+          <w:b w:val="0"/>
+          <w:sz w:val="21"/>
+        </w:rPr>
+        <w:t>Personal Portfolio Project</w:t>
+      </w:r>
+    </w:p>
+    <w:p>
+      <w:pPr>
+        <w:pStyle w:val="ListBullet"/>
+        <w:spacing w:after="40" w:line="240" w:lineRule="auto"/>
+      </w:pPr>
+      <w:r>
+        <w:rPr>
+          <w:rFonts w:ascii="Calibri" w:hAnsi="Calibri"/>
+          <w:b w:val="0"/>
+          <w:sz w:val="20"/>
+        </w:rPr>
+        <w:t>Built and deployed a responsive portfolio website for data science, AI engineering, analytics and AI consulting roles.</w:t>
+      </w:r>
+    </w:p>
+    <w:p>
+      <w:pPr>
+        <w:pStyle w:val="ListBullet"/>
+        <w:spacing w:after="40" w:line="240" w:lineRule="auto"/>
+      </w:pPr>
+      <w:r>
+        <w:rPr>
+          <w:rFonts w:ascii="Calibri" w:hAnsi="Calibri"/>
+          <w:b w:val="0"/>
+          <w:sz w:val="20"/>
+        </w:rPr>
+        <w:t>Implemented filterable project cards, case-study modals, CV downloads, contact workflows, animated visuals and a guided enquiry assistant using static HTML, CSS, JavaScript, Canvas and WebGL.</w:t>
+      </w:r>
+    </w:p>
+    <w:p>
+      <w:pPr>
+        <w:pStyle w:val="ListBullet"/>
+        <w:spacing w:after="40" w:line="240" w:lineRule="auto"/>
+      </w:pPr>
+      <w:r>
+        <w:rPr>
+          <w:rFonts w:ascii="Calibri" w:hAnsi="Calibri"/>
+          <w:b w:val="0"/>
+          <w:sz w:val="20"/>
+        </w:rPr>
+        <w:t>Published the source code on GitHub and deployed the live site on Vercel.</w:t>
+      </w:r>
+    </w:p>
+    <w:p>
+      <w:pPr>
+        <w:pStyle w:val="ListBullet"/>
+        <w:spacing w:after="40" w:line="240" w:lineRule="auto"/>
+      </w:pPr>
+      <w:r>
+        <w:rPr>
+          <w:rFonts w:ascii="Calibri" w:hAnsi="Calibri"/>
+          <w:b w:val="0"/>
+          <w:sz w:val="20"/>
+        </w:rPr>
+        <w:t>Live portfolio: https://mohammed-siddique-data-ai-portfolio.vercel.app</w:t>
+      </w:r>
+    </w:p>
+    <w:p>
+      <w:pPr>
+        <w:pStyle w:val="ListBullet"/>
+        <w:spacing w:after="40" w:line="240" w:lineRule="auto"/>
+      </w:pPr>
+      <w:r>
+        <w:rPr>
+          <w:rFonts w:ascii="Calibri" w:hAnsi="Calibri"/>
+          <w:b w:val="0"/>
+          <w:sz w:val="20"/>
+        </w:rPr>
+        <w:t>GitHub repository: https://github.com/MohammedSiddique8998/mohammed-siddique-data-ai-portfolio</w:t>
       </w:r>
     </w:p>
     <w:p>

</xml_diff>

<commit_message>
Add Applied AI image classification project link
</commit_message>
<xml_diff>
--- a/assets/Mohammed_Siddique_Master_CV.docx
+++ b/assets/Mohammed_Siddique_Master_CV.docx
@@ -1247,20 +1247,6 @@
     </w:p>
     <w:p>
       <w:pPr>
-        <w:keepNext/>
-        <w:spacing w:before="80" w:after="20" w:line="240" w:lineRule="auto"/>
-      </w:pPr>
-      <w:r>
-        <w:rPr>
-          <w:rFonts w:ascii="Calibri" w:hAnsi="Calibri"/>
-          <w:b/>
-          <w:sz w:val="21"/>
-        </w:rPr>
-        <w:t>Brain Tumour Detection using Deep Learning</w:t>
-      </w:r>
-    </w:p>
-    <w:p>
-      <w:pPr>
         <w:spacing w:before="0" w:after="60" w:line="240" w:lineRule="auto"/>
       </w:pPr>
       <w:r>
@@ -1269,7 +1255,20 @@
           <w:b w:val="0"/>
           <w:sz w:val="21"/>
         </w:rPr>
-        <w:t>Current / Developing Project</w:t>
+        <w:t>Applied AI Chest X-ray Image Classification</w:t>
+      </w:r>
+    </w:p>
+    <w:p>
+      <w:pPr>
+        <w:spacing w:before="0" w:after="60" w:line="240" w:lineRule="auto"/>
+      </w:pPr>
+      <w:r>
+        <w:rPr>
+          <w:rFonts w:ascii="Calibri" w:hAnsi="Calibri"/>
+          <w:b w:val="0"/>
+          <w:sz w:val="21"/>
+        </w:rPr>
+        <w:t>Portfolio Project</w:t>
       </w:r>
     </w:p>
     <w:p>
@@ -1283,7 +1282,7 @@
           <w:b w:val="0"/>
           <w:sz w:val="20"/>
         </w:rPr>
-        <w:t>Built a deep learning image-classification workflow using TensorFlow and Keras to detect brain tumours from MRI scan images.</w:t>
+        <w:t>Built a cleaned computer vision portfolio project for three-class chest X-ray classification: Normal, Opacity and Pneumonia.</w:t>
       </w:r>
     </w:p>
     <w:p>
@@ -1297,7 +1296,7 @@
           <w:b w:val="0"/>
           <w:sz w:val="20"/>
         </w:rPr>
-        <w:t>Applied transfer learning with CNN architectures such as VGG16 and ResNet50 to improve classification performance.</w:t>
+        <w:t>Compared a custom CNN trained from scratch against DenseNet121 feature extraction and fine-tuning using stratified train, validation and test splits.</w:t>
       </w:r>
     </w:p>
     <w:p>
@@ -1311,7 +1310,35 @@
           <w:b w:val="0"/>
           <w:sz w:val="20"/>
         </w:rPr>
-        <w:t>Performed dataset preprocessing, augmentation and model evaluation to improve predictive accuracy.</w:t>
+        <w:t>Applied image preprocessing, conservative augmentation, PyTorch model training, confusion matrix evaluation and responsible limitations reporting.</w:t>
+      </w:r>
+    </w:p>
+    <w:p>
+      <w:pPr>
+        <w:pStyle w:val="ListBullet"/>
+        <w:spacing w:after="40" w:line="240" w:lineRule="auto"/>
+      </w:pPr>
+      <w:r>
+        <w:rPr>
+          <w:rFonts w:ascii="Calibri" w:hAnsi="Calibri"/>
+          <w:b w:val="0"/>
+          <w:sz w:val="20"/>
+        </w:rPr>
+        <w:t>Achieved 91.57% held-out test accuracy, 0.9175 macro F1-score and 0.8733 Cohen's Kappa with the selected custom CNN.</w:t>
+      </w:r>
+    </w:p>
+    <w:p>
+      <w:pPr>
+        <w:pStyle w:val="ListBullet"/>
+        <w:spacing w:after="40" w:line="240" w:lineRule="auto"/>
+      </w:pPr>
+      <w:r>
+        <w:rPr>
+          <w:rFonts w:ascii="Calibri" w:hAnsi="Calibri"/>
+          <w:b w:val="0"/>
+          <w:sz w:val="20"/>
+        </w:rPr>
+        <w:t>GitHub repository: https://github.com/MohammedSiddique8998/applied-ai-image-classification</w:t>
       </w:r>
     </w:p>
     <w:p>

</xml_diff>

<commit_message>
Correct Applied AI portfolio claims
</commit_message>
<xml_diff>
--- a/assets/Mohammed_Siddique_Master_CV.docx
+++ b/assets/Mohammed_Siddique_Master_CV.docx
@@ -1296,7 +1296,7 @@
           <w:b w:val="0"/>
           <w:sz w:val="20"/>
         </w:rPr>
-        <w:t>Compared a custom CNN trained from scratch against DenseNet121 feature extraction and fine-tuning using stratified train, validation and test splits.</w:t>
+        <w:t>Developed a reproducible PyTorch training and evaluation pipeline with a custom CNN and DenseNet121 feature extraction/fine-tuning options.</w:t>
       </w:r>
     </w:p>
     <w:p>
@@ -1310,7 +1310,7 @@
           <w:b w:val="0"/>
           <w:sz w:val="20"/>
         </w:rPr>
-        <w:t>Applied image preprocessing, conservative augmentation, PyTorch model training, confusion matrix evaluation and responsible limitations reporting.</w:t>
+        <w:t>Documented seed, batch size, image size, split assumptions, preprocessing, augmentation, class imbalance handling and model selection rules.</w:t>
       </w:r>
     </w:p>
     <w:p>
@@ -1324,7 +1324,21 @@
           <w:b w:val="0"/>
           <w:sz w:val="20"/>
         </w:rPr>
-        <w:t>Achieved 91.57% held-out test accuracy, 0.9175 macro F1-score and 0.8733 Cohen's Kappa with the selected custom CNN.</w:t>
+        <w:t>Added imbalance-aware evaluation outputs including balanced accuracy, macro precision/recall/F1, weighted F1, class-wise reporting and normalised confusion matrix generation.</w:t>
+      </w:r>
+    </w:p>
+    <w:p>
+      <w:pPr>
+        <w:pStyle w:val="ListBullet"/>
+        <w:spacing w:after="40" w:line="240" w:lineRule="auto"/>
+      </w:pPr>
+      <w:r>
+        <w:rPr>
+          <w:rFonts w:ascii="Calibri" w:hAnsi="Calibri"/>
+          <w:b w:val="0"/>
+          <w:sz w:val="20"/>
+        </w:rPr>
+        <w:t>Corrected the public repository to remove unsupported historical result claims; metrics are intended to be regenerated locally using a permitted dataset and current code.</w:t>
       </w:r>
     </w:p>
     <w:p>

</xml_diff>

<commit_message>
Add bio-inspired bandit project link
</commit_message>
<xml_diff>
--- a/assets/Mohammed_Siddique_Master_CV.docx
+++ b/assets/Mohammed_Siddique_Master_CV.docx
@@ -1509,20 +1509,6 @@
     </w:p>
     <w:p>
       <w:pPr>
-        <w:keepNext/>
-        <w:spacing w:before="80" w:after="20" w:line="240" w:lineRule="auto"/>
-      </w:pPr>
-      <w:r>
-        <w:rPr>
-          <w:rFonts w:ascii="Calibri" w:hAnsi="Calibri"/>
-          <w:b/>
-          <w:sz w:val="21"/>
-        </w:rPr>
-        <w:t>Multi-Armed Bandit Reinforcement Learning Simulation</w:t>
-      </w:r>
-    </w:p>
-    <w:p>
-      <w:pPr>
         <w:spacing w:before="0" w:after="60" w:line="240" w:lineRule="auto"/>
       </w:pPr>
       <w:r>
@@ -1531,7 +1517,20 @@
           <w:b w:val="0"/>
           <w:sz w:val="21"/>
         </w:rPr>
-        <w:t>Machine Learning Assignment, University of Liverpool</w:t>
+        <w:t>Bio-Inspired Multi-Armed Bandit Reinforcement Learning</w:t>
+      </w:r>
+    </w:p>
+    <w:p>
+      <w:pPr>
+        <w:spacing w:before="0" w:after="60" w:line="240" w:lineRule="auto"/>
+      </w:pPr>
+      <w:r>
+        <w:rPr>
+          <w:rFonts w:ascii="Calibri" w:hAnsi="Calibri"/>
+          <w:b w:val="0"/>
+          <w:sz w:val="21"/>
+        </w:rPr>
+        <w:t>Portfolio Project</w:t>
       </w:r>
     </w:p>
     <w:p>
@@ -1545,7 +1544,7 @@
           <w:b w:val="0"/>
           <w:sz w:val="20"/>
         </w:rPr>
-        <w:t>Implemented a reinforcement learning experiment based on the n-armed bandit problem to study exploration-exploitation strategies.</w:t>
+        <w:t>Built a clean NumPy-based reinforcement learning simulation for stationary Gaussian n-armed bandits across 5-arm, 10-arm and 20-arm settings.</w:t>
       </w:r>
     </w:p>
     <w:p>
@@ -1559,7 +1558,7 @@
           <w:b w:val="0"/>
           <w:sz w:val="20"/>
         </w:rPr>
-        <w:t>Compared decision policies including epsilon-greedy and Upper Confidence Bound methods.</w:t>
+        <w:t>Compared random, greedy, epsilon-greedy and Upper Confidence Bound policies to analyse exploration-exploitation trade-offs.</w:t>
       </w:r>
     </w:p>
     <w:p>
@@ -1573,7 +1572,7 @@
           <w:b w:val="0"/>
           <w:sz w:val="20"/>
         </w:rPr>
-        <w:t>Simulated 2,000 decision steps to analyse reward optimisation and optimal action-selection performance.</w:t>
+        <w:t>Generated reproducible average-reward and optimal-action-rate plots from current code using 500 runs and 1,000 steps per experiment setting.</w:t>
       </w:r>
     </w:p>
     <w:p>
@@ -1587,7 +1586,21 @@
           <w:b w:val="0"/>
           <w:sz w:val="20"/>
         </w:rPr>
-        <w:t>Documented experimental results in a research-style format, analysing reward trends and sequential decision-making behaviour.</w:t>
+        <w:t>Summarised final-window policy performance, with UCB c=2 producing the strongest average reward in the generated experiments.</w:t>
+      </w:r>
+    </w:p>
+    <w:p>
+      <w:pPr>
+        <w:pStyle w:val="ListBullet"/>
+        <w:spacing w:after="40" w:line="240" w:lineRule="auto"/>
+      </w:pPr>
+      <w:r>
+        <w:rPr>
+          <w:rFonts w:ascii="Calibri" w:hAnsi="Calibri"/>
+          <w:b w:val="0"/>
+          <w:sz w:val="20"/>
+        </w:rPr>
+        <w:t>GitHub repository: https://github.com/MohammedSiddique8998/bio-inspired-multi-armed-bandit-rl</w:t>
       </w:r>
     </w:p>
     <w:p>

</xml_diff>

<commit_message>
Add data mining text clustering project
</commit_message>
<xml_diff>
--- a/assets/Mohammed_Siddique_Master_CV.docx
+++ b/assets/Mohammed_Siddique_Master_CV.docx
@@ -1601,6 +1601,102 @@
           <w:sz w:val="20"/>
         </w:rPr>
         <w:t>GitHub repository: https://github.com/MohammedSiddique8998/bio-inspired-multi-armed-bandit-rl</w:t>
+      </w:r>
+    </w:p>
+    <w:p>
+      <w:pPr>
+        <w:spacing w:before="0" w:after="60" w:line="240" w:lineRule="auto"/>
+      </w:pPr>
+      <w:r>
+        <w:rPr>
+          <w:rFonts w:ascii="Calibri" w:hAnsi="Calibri"/>
+          <w:b w:val="0"/>
+          <w:sz w:val="21"/>
+        </w:rPr>
+        <w:t>Data Mining Text Clustering and Visualisation</w:t>
+      </w:r>
+    </w:p>
+    <w:p>
+      <w:pPr>
+        <w:spacing w:before="0" w:after="60" w:line="240" w:lineRule="auto"/>
+      </w:pPr>
+      <w:r>
+        <w:rPr>
+          <w:rFonts w:ascii="Calibri" w:hAnsi="Calibri"/>
+          <w:b w:val="0"/>
+          <w:sz w:val="21"/>
+        </w:rPr>
+        <w:t>Portfolio Project</w:t>
+      </w:r>
+    </w:p>
+    <w:p>
+      <w:pPr>
+        <w:pStyle w:val="ListBullet"/>
+        <w:spacing w:after="40" w:line="240" w:lineRule="auto"/>
+      </w:pPr>
+      <w:r>
+        <w:rPr>
+          <w:rFonts w:ascii="Calibri" w:hAnsi="Calibri"/>
+          <w:b w:val="0"/>
+          <w:sz w:val="20"/>
+        </w:rPr>
+        <w:t>Built a public-safe unsupervised text clustering project using sentence preprocessing, TF-IDF vectorisation, K-Means clustering and PCA visualisation.</w:t>
+      </w:r>
+    </w:p>
+    <w:p>
+      <w:pPr>
+        <w:pStyle w:val="ListBullet"/>
+        <w:spacing w:after="40" w:line="240" w:lineRule="auto"/>
+      </w:pPr>
+      <w:r>
+        <w:rPr>
+          <w:rFonts w:ascii="Calibri" w:hAnsi="Calibri"/>
+          <w:b w:val="0"/>
+          <w:sz w:val="20"/>
+        </w:rPr>
+        <w:t>Created a reproducible demo corpus and generated current results from code, including selected K=4, silhouette score of 0.2111 and balanced 10-document clusters.</w:t>
+      </w:r>
+    </w:p>
+    <w:p>
+      <w:pPr>
+        <w:pStyle w:val="ListBullet"/>
+        <w:spacing w:after="40" w:line="240" w:lineRule="auto"/>
+      </w:pPr>
+      <w:r>
+        <w:rPr>
+          <w:rFonts w:ascii="Calibri" w:hAnsi="Calibri"/>
+          <w:b w:val="0"/>
+          <w:sz w:val="20"/>
+        </w:rPr>
+        <w:t>Interpreted clusters using top TF-IDF terms across data analytics, healthcare, energy/sustainability and career/portfolio themes.</w:t>
+      </w:r>
+    </w:p>
+    <w:p>
+      <w:pPr>
+        <w:pStyle w:val="ListBullet"/>
+        <w:spacing w:after="40" w:line="240" w:lineRule="auto"/>
+      </w:pPr>
+      <w:r>
+        <w:rPr>
+          <w:rFonts w:ascii="Calibri" w:hAnsi="Calibri"/>
+          <w:b w:val="0"/>
+          <w:sz w:val="20"/>
+        </w:rPr>
+        <w:t>Documented dataset limitations and provided instructions for replacing the demo corpus with a permitted local TSV dataset.</w:t>
+      </w:r>
+    </w:p>
+    <w:p>
+      <w:pPr>
+        <w:pStyle w:val="ListBullet"/>
+        <w:spacing w:after="40" w:line="240" w:lineRule="auto"/>
+      </w:pPr>
+      <w:r>
+        <w:rPr>
+          <w:rFonts w:ascii="Calibri" w:hAnsi="Calibri"/>
+          <w:b w:val="0"/>
+          <w:sz w:val="20"/>
+        </w:rPr>
+        <w:t>GitHub repository: https://github.com/MohammedSiddique8998/data-mining-text-clustering</w:t>
       </w:r>
     </w:p>
     <w:p>

</xml_diff>

<commit_message>
Add industry showcase churn intelligence project
</commit_message>
<xml_diff>
--- a/assets/Mohammed_Siddique_Master_CV.docx
+++ b/assets/Mohammed_Siddique_Master_CV.docx
@@ -501,7 +501,7 @@
           <w:b w:val="0"/>
           <w:sz w:val="20"/>
         </w:rPr>
-        <w:t>Relevant modules include Programming Fundamentals for Data Science, Databases and SQL, Data Mining and Visualisation, Machine Learning and Bio-Inspired Learning, Computational Intelligence, Applied AI and Machine Learning, Applied Statistics, Research Methods and Employability Skills.</w:t>
+        <w:t>Relevant learning areas include Python programming, databases and SQL, statistical modelling, machine learning, computational intelligence, visual analytics, research methods and employability skills.</w:t>
       </w:r>
     </w:p>
     <w:p>
@@ -1164,6 +1164,102 @@
     </w:p>
     <w:p>
       <w:pPr>
+        <w:spacing w:before="0" w:after="60" w:line="240" w:lineRule="auto"/>
+      </w:pPr>
+      <w:r>
+        <w:rPr>
+          <w:rFonts w:ascii="Calibri" w:hAnsi="Calibri"/>
+          <w:b w:val="0"/>
+          <w:sz w:val="21"/>
+        </w:rPr>
+        <w:t>Real-Time Customer Insight and Churn Intelligence Platform</w:t>
+      </w:r>
+    </w:p>
+    <w:p>
+      <w:pPr>
+        <w:spacing w:before="0" w:after="60" w:line="240" w:lineRule="auto"/>
+      </w:pPr>
+      <w:r>
+        <w:rPr>
+          <w:rFonts w:ascii="Calibri" w:hAnsi="Calibri"/>
+          <w:b w:val="0"/>
+          <w:sz w:val="21"/>
+        </w:rPr>
+        <w:t>Portfolio Project</w:t>
+      </w:r>
+    </w:p>
+    <w:p>
+      <w:pPr>
+        <w:pStyle w:val="ListBullet"/>
+        <w:spacing w:after="40" w:line="240" w:lineRule="auto"/>
+      </w:pPr>
+      <w:r>
+        <w:rPr>
+          <w:rFonts w:ascii="Calibri" w:hAnsi="Calibri"/>
+          <w:b w:val="0"/>
+          <w:sz w:val="20"/>
+        </w:rPr>
+        <w:t>Built a Streamlit customer analytics dashboard using synthetic interaction data to score churn risk and prioritise retention actions.</w:t>
+      </w:r>
+    </w:p>
+    <w:p>
+      <w:pPr>
+        <w:pStyle w:val="ListBullet"/>
+        <w:spacing w:after="40" w:line="240" w:lineRule="auto"/>
+      </w:pPr>
+      <w:r>
+        <w:rPr>
+          <w:rFonts w:ascii="Calibri" w:hAnsi="Calibri"/>
+          <w:b w:val="0"/>
+          <w:sz w:val="20"/>
+        </w:rPr>
+        <w:t>Created reproducible data-generation and sample-output scripts for 300 synthetic customers.</w:t>
+      </w:r>
+    </w:p>
+    <w:p>
+      <w:pPr>
+        <w:pStyle w:val="ListBullet"/>
+        <w:spacing w:after="40" w:line="240" w:lineRule="auto"/>
+      </w:pPr>
+      <w:r>
+        <w:rPr>
+          <w:rFonts w:ascii="Calibri" w:hAnsi="Calibri"/>
+          <w:b w:val="0"/>
+          <w:sz w:val="20"/>
+        </w:rPr>
+        <w:t>Engineered interpretable risk scoring using support tickets, sentiment, usage, login recency, spend, tenure and NPS-style signals.</w:t>
+      </w:r>
+    </w:p>
+    <w:p>
+      <w:pPr>
+        <w:pStyle w:val="ListBullet"/>
+        <w:spacing w:after="40" w:line="240" w:lineRule="auto"/>
+      </w:pPr>
+      <w:r>
+        <w:rPr>
+          <w:rFonts w:ascii="Calibri" w:hAnsi="Calibri"/>
+          <w:b w:val="0"/>
+          <w:sz w:val="20"/>
+        </w:rPr>
+        <w:t>Added segmentation, retention recommendations, sample metrics and Handshake showcase submission material.</w:t>
+      </w:r>
+    </w:p>
+    <w:p>
+      <w:pPr>
+        <w:pStyle w:val="ListBullet"/>
+        <w:spacing w:after="40" w:line="240" w:lineRule="auto"/>
+      </w:pPr>
+      <w:r>
+        <w:rPr>
+          <w:rFonts w:ascii="Calibri" w:hAnsi="Calibri"/>
+          <w:b w:val="0"/>
+          <w:sz w:val="20"/>
+        </w:rPr>
+        <w:t>GitHub repository: https://github.com/MohammedSiddique8998/real-time-customer-insight-churn-platform</w:t>
+      </w:r>
+    </w:p>
+    <w:p>
+      <w:pPr>
         <w:keepNext/>
         <w:spacing w:before="80" w:after="20" w:line="240" w:lineRule="auto"/>
       </w:pPr>
@@ -1255,7 +1351,7 @@
           <w:b w:val="0"/>
           <w:sz w:val="21"/>
         </w:rPr>
-        <w:t>Applied AI Chest X-ray Image Classification</w:t>
+        <w:t>Intelligent Visual Classification Pipeline</w:t>
       </w:r>
     </w:p>
     <w:p>
@@ -1352,7 +1448,7 @@
           <w:b w:val="0"/>
           <w:sz w:val="20"/>
         </w:rPr>
-        <w:t>GitHub repository: https://github.com/MohammedSiddique8998/applied-ai-image-classification</w:t>
+        <w:t>GitHub repository: https://github.com/MohammedSiddique8998/intelligent-visual-classification-pipeline</w:t>
       </w:r>
     </w:p>
     <w:p>
@@ -1517,7 +1613,7 @@
           <w:b w:val="0"/>
           <w:sz w:val="21"/>
         </w:rPr>
-        <w:t>Bio-Inspired Multi-Armed Bandit Reinforcement Learning</w:t>
+        <w:t>Adaptive Decision Optimization Engine</w:t>
       </w:r>
     </w:p>
     <w:p>
@@ -1600,7 +1696,7 @@
           <w:b w:val="0"/>
           <w:sz w:val="20"/>
         </w:rPr>
-        <w:t>GitHub repository: https://github.com/MohammedSiddique8998/bio-inspired-multi-armed-bandit-rl</w:t>
+        <w:t>GitHub repository: https://github.com/MohammedSiddique8998/adaptive-decision-optimization-engine</w:t>
       </w:r>
     </w:p>
     <w:p>
@@ -1613,7 +1709,7 @@
           <w:b w:val="0"/>
           <w:sz w:val="21"/>
         </w:rPr>
-        <w:t>Data Mining Text Clustering and Visualisation</w:t>
+        <w:t>Customer Feedback Theme Discovery</w:t>
       </w:r>
     </w:p>
     <w:p>
@@ -1696,7 +1792,7 @@
           <w:b w:val="0"/>
           <w:sz w:val="20"/>
         </w:rPr>
-        <w:t>GitHub repository: https://github.com/MohammedSiddique8998/data-mining-text-clustering</w:t>
+        <w:t>GitHub repository: https://github.com/MohammedSiddique8998/customer-feedback-theme-discovery</w:t>
       </w:r>
     </w:p>
     <w:p>

</xml_diff>